<commit_message>
finally got to put finalized one
</commit_message>
<xml_diff>
--- a/КН-25-1-1/атд/пр1 звіт.docx
+++ b/КН-25-1-1/атд/пр1 звіт.docx
@@ -325,31 +325,7 @@
               <w:rPr>
                 <w:noProof/>
               </w:rPr>
-              <w:fldChar w:fldCharType="begin"/>
-            </w:r>
-            <w:r>
-              <w:rPr>
-                <w:noProof/>
-              </w:rPr>
-              <w:instrText xml:space="preserve"> MERGEFIELD Закінчення </w:instrText>
-            </w:r>
-            <w:r>
-              <w:rPr>
-                <w:noProof/>
-              </w:rPr>
-              <w:fldChar w:fldCharType="separate"/>
-            </w:r>
-            <w:r>
-              <w:rPr>
-                <w:noProof/>
-              </w:rPr>
-              <w:t>ла</w:t>
-            </w:r>
-            <w:r>
-              <w:rPr>
-                <w:noProof/>
-              </w:rPr>
-              <w:fldChar w:fldCharType="end"/>
+              <w:t>в</w:t>
             </w:r>
             <w:r>
               <w:t>:</w:t>
@@ -366,7 +342,7 @@
               <w:rPr>
                 <w:noProof/>
               </w:rPr>
-              <w:t>Викладач</w:t>
+              <w:t>Доцент кафедри КІЕ</w:t>
             </w:r>
           </w:p>
           <w:p>
@@ -378,6 +354,12 @@
                 <w:noProof/>
               </w:rPr>
               <w:t>Сидоренко</w:t>
+            </w:r>
+            <w:r>
+              <w:rPr>
+                <w:noProof/>
+              </w:rPr>
+              <w:t xml:space="preserve"> В.М.</w:t>
             </w:r>
           </w:p>
         </w:tc>
@@ -1539,9 +1521,12 @@
           <w:rStyle w:val="math-inline"/>
           <w:sz w:val="28"/>
           <w:szCs w:val="28"/>
-        </w:rPr>
-        <w:t>$n$</w:t>
-      </w:r>
+          <w:lang w:val="en-US"/>
+        </w:rPr>
+        <w:t>n</w:t>
+      </w:r>
+      <w:bookmarkStart w:id="0" w:name="_GoBack"/>
+      <w:bookmarkEnd w:id="0"/>
       <w:r>
         <w:rPr>
           <w:sz w:val="28"/>
@@ -1600,8 +1585,6 @@
         </w:rPr>
         <w:t xml:space="preserve"> складності. Вона показує "найгірший сценарій": алгоритм точно не працюватиме повільніше, ніж ця межа.</w:t>
       </w:r>
-      <w:bookmarkStart w:id="0" w:name="_GoBack"/>
-      <w:bookmarkEnd w:id="0"/>
     </w:p>
     <w:p>
       <w:pPr>
@@ -2811,6 +2794,12 @@
   <wne:recipientData>
     <wne:active wne:val="1"/>
     <wne:hash wne:val="434135143"/>
+  </wne:recipientData>
+  <wne:recipientData>
+    <wne:active wne:val="1"/>
+  </wne:recipientData>
+  <wne:recipientData>
+    <wne:active wne:val="1"/>
   </wne:recipientData>
   <wne:recipientData>
     <wne:active wne:val="1"/>
@@ -3727,7 +3716,7 @@
 </file>
 
 <file path=customXml/itemProps1.xml><?xml version="1.0" encoding="utf-8"?>
-<ds:datastoreItem xmlns:ds="http://schemas.openxmlformats.org/officeDocument/2006/customXml" ds:itemID="{85A97602-44E3-4C65-94E9-C36CA9AFFE73}">
+<ds:datastoreItem xmlns:ds="http://schemas.openxmlformats.org/officeDocument/2006/customXml" ds:itemID="{5AD495E5-A2CE-4C37-BF53-306071D03022}">
   <ds:schemaRefs>
     <ds:schemaRef ds:uri="http://schemas.openxmlformats.org/officeDocument/2006/bibliography"/>
   </ds:schemaRefs>

</xml_diff>